<commit_message>
Add topic numbering (Chu de 1-8) to merged science file
Co-Authored-By: Claude Opus 4.6 <noreply@anthropic.com>
Claude-Session: https://claude.ai/code/session_019c21J63jBoMJg6QqQWvp8F
</commit_message>
<xml_diff>
--- a/3_Dap_an_goc_Khoa_hoc_8_chu_de.docx
+++ b/3_Dap_an_goc_Khoa_hoc_8_chu_de.docx
@@ -14,7 +14,7 @@
           <w:color w:val="000000"/>
           <w:sz w:val="24"/>
         </w:rPr>
-        <w:t xml:space="preserve">CHỦ ĐỀ. </w:t>
+        <w:t xml:space="preserve">Chủ đề 1. </w:t>
       </w:r>
       <w:r>
         <w:rPr>
@@ -3018,7 +3018,7 @@
           <w:sz w:val="24"/>
           <w:szCs w:val="24"/>
         </w:rPr>
-        <w:t xml:space="preserve">CHỦ ĐỀ. </w:t>
+        <w:t xml:space="preserve">Chủ đề 2. </w:t>
       </w:r>
       <w:r>
         <w:rPr>
@@ -6490,7 +6490,7 @@
           <w:sz w:val="24"/>
           <w:szCs w:val="24"/>
         </w:rPr>
-        <w:t xml:space="preserve">CHỦ ĐỀ. </w:t>
+        <w:t xml:space="preserve">Chủ đề 3. </w:t>
       </w:r>
       <w:r>
         <w:rPr>
@@ -10660,7 +10660,7 @@
         <w:rPr>
           <w:b/>
         </w:rPr>
-        <w:t xml:space="preserve">CHỦ ĐỀ. </w:t>
+        <w:t xml:space="preserve">Chủ đề 4. </w:t>
       </w:r>
       <w:r>
         <w:rPr>
@@ -12427,7 +12427,7 @@
           <w:sz w:val="24"/>
           <w:szCs w:val="24"/>
         </w:rPr>
-        <w:t xml:space="preserve">CHỦ ĐỀ. </w:t>
+        <w:t xml:space="preserve">Chủ đề 5. </w:t>
       </w:r>
       <w:r>
         <w:rPr>
@@ -16873,7 +16873,7 @@
           <w:b/>
           <w:bCs/>
         </w:rPr>
-        <w:t xml:space="preserve">CHỦ ĐỀ: </w:t>
+        <w:t xml:space="preserve">Chủ đề 6: </w:t>
       </w:r>
       <w:proofErr w:type="spellStart"/>
       <w:r>
@@ -28533,7 +28533,7 @@
           <w:b/>
           <w:color w:val="000000"/>
         </w:rPr>
-        <w:t xml:space="preserve">CHỦ ĐỀ. </w:t>
+        <w:t xml:space="preserve">Chủ đề 7. </w:t>
       </w:r>
       <w:r>
         <w:rPr>
@@ -30940,7 +30940,7 @@
           <w:b/>
           <w:bCs/>
         </w:rPr>
-        <w:t xml:space="preserve">CHỦ ĐỀ: </w:t>
+        <w:t xml:space="preserve">Chủ đề 8: </w:t>
       </w:r>
       <w:proofErr w:type="spellStart"/>
       <w:r>
@@ -44849,7 +44849,7 @@
     </w:lvl>
   </w:abstractNum>
   <w:abstractNum w:abstractNumId="9" w15:restartNumberingAfterBreak="0">
-    <w:nsid w:val="00D974DF"/>
+    <w:nsid w:val="017067D0"/>
     <w:multiLevelType w:val="hybridMultilevel"/>
     <w:tmpl w:val="797CFE56"/>
     <w:lvl w:ilvl="0" w:tplc="E510312E">
@@ -44935,7 +44935,7 @@
     </w:lvl>
   </w:abstractNum>
   <w:abstractNum w:abstractNumId="10" w15:restartNumberingAfterBreak="0">
-    <w:nsid w:val="0288FBE2"/>
+    <w:nsid w:val="00C7B271"/>
     <w:multiLevelType w:val="multilevel"/>
     <w:tmpl w:val="443C0F20"/>
     <w:lvl w:ilvl="0">

</xml_diff>